<commit_message>
fix: indice - pré projeto completo
</commit_message>
<xml_diff>
--- a/Pre_Projeto_TCC_Iluminacao_Completo.docx
+++ b/Pre_Projeto_TCC_Iluminacao_Completo.docx
@@ -607,6 +607,12 @@
     </w:p>
     <w:sdt>
       <w:sdtPr>
+        <w:rPr>
+          <w:rFonts w:ascii="Arial" w:eastAsia="Arial" w:hAnsi="Arial" w:cs="Arial"/>
+          <w:color w:val="000000"/>
+          <w:sz w:val="24"/>
+          <w:szCs w:val="24"/>
+        </w:rPr>
         <w:id w:val="-113218181"/>
         <w:docPartObj>
           <w:docPartGallery w:val="Table of Contents"/>
@@ -615,13 +621,9 @@
       </w:sdtPr>
       <w:sdtEndPr>
         <w:rPr>
-          <w:rFonts w:ascii="Arial" w:eastAsia="Arial" w:hAnsi="Arial" w:cs="Arial"/>
           <w:b/>
           <w:bCs/>
           <w:noProof/>
-          <w:color w:val="000000"/>
-          <w:sz w:val="24"/>
-          <w:szCs w:val="24"/>
         </w:rPr>
       </w:sdtEndPr>
       <w:sdtContent>
@@ -637,7 +639,11 @@
               <w:tab w:val="right" w:leader="dot" w:pos="9061"/>
             </w:tabs>
             <w:rPr>
+              <w:rFonts w:asciiTheme="minorHAnsi" w:eastAsiaTheme="minorEastAsia" w:hAnsiTheme="minorHAnsi" w:cstheme="minorBidi"/>
               <w:noProof/>
+              <w:color w:val="auto"/>
+              <w:kern w:val="2"/>
+              <w14:ligatures w14:val="standardContextual"/>
             </w:rPr>
           </w:pPr>
           <w:r>
@@ -649,7 +655,7 @@
           <w:r>
             <w:fldChar w:fldCharType="separate"/>
           </w:r>
-          <w:hyperlink w:anchor="_Toc240219609" w:history="1">
+          <w:hyperlink w:anchor="_Toc240223120" w:history="1">
             <w:r>
               <w:rPr>
                 <w:rStyle w:val="Hyperlink"/>
@@ -677,7 +683,7 @@
                 <w:noProof/>
                 <w:webHidden/>
               </w:rPr>
-              <w:instrText xml:space="preserve"> PAGEREF _Toc240219609 \h </w:instrText>
+              <w:instrText xml:space="preserve"> PAGEREF _Toc240223120 \h </w:instrText>
             </w:r>
             <w:r>
               <w:rPr>
@@ -697,7 +703,7 @@
                 <w:noProof/>
                 <w:webHidden/>
               </w:rPr>
-              <w:t>4</w:t>
+              <w:t>5</w:t>
             </w:r>
             <w:r>
               <w:rPr>
@@ -715,10 +721,14 @@
               <w:tab w:val="right" w:leader="dot" w:pos="9061"/>
             </w:tabs>
             <w:rPr>
+              <w:rFonts w:asciiTheme="minorHAnsi" w:eastAsiaTheme="minorEastAsia" w:hAnsiTheme="minorHAnsi" w:cstheme="minorBidi"/>
               <w:noProof/>
+              <w:color w:val="auto"/>
+              <w:kern w:val="2"/>
+              <w14:ligatures w14:val="standardContextual"/>
             </w:rPr>
           </w:pPr>
-          <w:hyperlink w:anchor="_Toc240219610" w:history="1">
+          <w:hyperlink w:anchor="_Toc240223121" w:history="1">
             <w:r>
               <w:rPr>
                 <w:rStyle w:val="Hyperlink"/>
@@ -746,7 +756,7 @@
                 <w:noProof/>
                 <w:webHidden/>
               </w:rPr>
-              <w:instrText xml:space="preserve"> PAGEREF _Toc240219610 \h </w:instrText>
+              <w:instrText xml:space="preserve"> PAGEREF _Toc240223121 \h </w:instrText>
             </w:r>
             <w:r>
               <w:rPr>
@@ -766,7 +776,7 @@
                 <w:noProof/>
                 <w:webHidden/>
               </w:rPr>
-              <w:t>4</w:t>
+              <w:t>5</w:t>
             </w:r>
             <w:r>
               <w:rPr>
@@ -784,10 +794,14 @@
               <w:tab w:val="right" w:leader="dot" w:pos="9061"/>
             </w:tabs>
             <w:rPr>
+              <w:rFonts w:asciiTheme="minorHAnsi" w:eastAsiaTheme="minorEastAsia" w:hAnsiTheme="minorHAnsi" w:cstheme="minorBidi"/>
               <w:noProof/>
+              <w:color w:val="auto"/>
+              <w:kern w:val="2"/>
+              <w14:ligatures w14:val="standardContextual"/>
             </w:rPr>
           </w:pPr>
-          <w:hyperlink w:anchor="_Toc240219611" w:history="1">
+          <w:hyperlink w:anchor="_Toc240223122" w:history="1">
             <w:r>
               <w:rPr>
                 <w:rStyle w:val="Hyperlink"/>
@@ -815,7 +829,7 @@
                 <w:noProof/>
                 <w:webHidden/>
               </w:rPr>
-              <w:instrText xml:space="preserve"> PAGEREF _Toc240219611 \h </w:instrText>
+              <w:instrText xml:space="preserve"> PAGEREF _Toc240223122 \h </w:instrText>
             </w:r>
             <w:r>
               <w:rPr>
@@ -835,7 +849,7 @@
                 <w:noProof/>
                 <w:webHidden/>
               </w:rPr>
-              <w:t>5</w:t>
+              <w:t>6</w:t>
             </w:r>
             <w:r>
               <w:rPr>
@@ -853,10 +867,14 @@
               <w:tab w:val="right" w:leader="dot" w:pos="9061"/>
             </w:tabs>
             <w:rPr>
+              <w:rFonts w:asciiTheme="minorHAnsi" w:eastAsiaTheme="minorEastAsia" w:hAnsiTheme="minorHAnsi" w:cstheme="minorBidi"/>
               <w:noProof/>
+              <w:color w:val="auto"/>
+              <w:kern w:val="2"/>
+              <w14:ligatures w14:val="standardContextual"/>
             </w:rPr>
           </w:pPr>
-          <w:hyperlink w:anchor="_Toc240219612" w:history="1">
+          <w:hyperlink w:anchor="_Toc240223123" w:history="1">
             <w:r>
               <w:rPr>
                 <w:rStyle w:val="Hyperlink"/>
@@ -884,7 +902,7 @@
                 <w:noProof/>
                 <w:webHidden/>
               </w:rPr>
-              <w:instrText xml:space="preserve"> PAGEREF _Toc240219612 \h </w:instrText>
+              <w:instrText xml:space="preserve"> PAGEREF _Toc240223123 \h </w:instrText>
             </w:r>
             <w:r>
               <w:rPr>
@@ -904,7 +922,7 @@
                 <w:noProof/>
                 <w:webHidden/>
               </w:rPr>
-              <w:t>5</w:t>
+              <w:t>6</w:t>
             </w:r>
             <w:r>
               <w:rPr>
@@ -922,10 +940,14 @@
               <w:tab w:val="right" w:leader="dot" w:pos="9061"/>
             </w:tabs>
             <w:rPr>
+              <w:rFonts w:asciiTheme="minorHAnsi" w:eastAsiaTheme="minorEastAsia" w:hAnsiTheme="minorHAnsi" w:cstheme="minorBidi"/>
               <w:noProof/>
+              <w:color w:val="auto"/>
+              <w:kern w:val="2"/>
+              <w14:ligatures w14:val="standardContextual"/>
             </w:rPr>
           </w:pPr>
-          <w:hyperlink w:anchor="_Toc240219613" w:history="1">
+          <w:hyperlink w:anchor="_Toc240223124" w:history="1">
             <w:r>
               <w:rPr>
                 <w:rStyle w:val="Hyperlink"/>
@@ -953,7 +975,7 @@
                 <w:noProof/>
                 <w:webHidden/>
               </w:rPr>
-              <w:instrText xml:space="preserve"> PAGEREF _Toc240219613 \h </w:instrText>
+              <w:instrText xml:space="preserve"> PAGEREF _Toc240223124 \h </w:instrText>
             </w:r>
             <w:r>
               <w:rPr>
@@ -973,7 +995,7 @@
                 <w:noProof/>
                 <w:webHidden/>
               </w:rPr>
-              <w:t>5</w:t>
+              <w:t>6</w:t>
             </w:r>
             <w:r>
               <w:rPr>
@@ -991,10 +1013,14 @@
               <w:tab w:val="right" w:leader="dot" w:pos="9061"/>
             </w:tabs>
             <w:rPr>
+              <w:rFonts w:asciiTheme="minorHAnsi" w:eastAsiaTheme="minorEastAsia" w:hAnsiTheme="minorHAnsi" w:cstheme="minorBidi"/>
               <w:noProof/>
+              <w:color w:val="auto"/>
+              <w:kern w:val="2"/>
+              <w14:ligatures w14:val="standardContextual"/>
             </w:rPr>
           </w:pPr>
-          <w:hyperlink w:anchor="_Toc240219614" w:history="1">
+          <w:hyperlink w:anchor="_Toc240223125" w:history="1">
             <w:r>
               <w:rPr>
                 <w:rStyle w:val="Hyperlink"/>
@@ -1022,7 +1048,7 @@
                 <w:noProof/>
                 <w:webHidden/>
               </w:rPr>
-              <w:instrText xml:space="preserve"> PAGEREF _Toc240219614 \h </w:instrText>
+              <w:instrText xml:space="preserve"> PAGEREF _Toc240223125 \h </w:instrText>
             </w:r>
             <w:r>
               <w:rPr>
@@ -1042,7 +1068,7 @@
                 <w:noProof/>
                 <w:webHidden/>
               </w:rPr>
-              <w:t>6</w:t>
+              <w:t>7</w:t>
             </w:r>
             <w:r>
               <w:rPr>
@@ -1060,10 +1086,14 @@
               <w:tab w:val="right" w:leader="dot" w:pos="9061"/>
             </w:tabs>
             <w:rPr>
+              <w:rFonts w:asciiTheme="minorHAnsi" w:eastAsiaTheme="minorEastAsia" w:hAnsiTheme="minorHAnsi" w:cstheme="minorBidi"/>
               <w:noProof/>
+              <w:color w:val="auto"/>
+              <w:kern w:val="2"/>
+              <w14:ligatures w14:val="standardContextual"/>
             </w:rPr>
           </w:pPr>
-          <w:hyperlink w:anchor="_Toc240219615" w:history="1">
+          <w:hyperlink w:anchor="_Toc240223126" w:history="1">
             <w:r>
               <w:rPr>
                 <w:rStyle w:val="Hyperlink"/>
@@ -1091,7 +1121,7 @@
                 <w:noProof/>
                 <w:webHidden/>
               </w:rPr>
-              <w:instrText xml:space="preserve"> PAGEREF _Toc240219615 \h </w:instrText>
+              <w:instrText xml:space="preserve"> PAGEREF _Toc240223126 \h </w:instrText>
             </w:r>
             <w:r>
               <w:rPr>
@@ -1111,7 +1141,7 @@
                 <w:noProof/>
                 <w:webHidden/>
               </w:rPr>
-              <w:t>7</w:t>
+              <w:t>8</w:t>
             </w:r>
             <w:r>
               <w:rPr>
@@ -1129,10 +1159,14 @@
               <w:tab w:val="right" w:leader="dot" w:pos="9061"/>
             </w:tabs>
             <w:rPr>
+              <w:rFonts w:asciiTheme="minorHAnsi" w:eastAsiaTheme="minorEastAsia" w:hAnsiTheme="minorHAnsi" w:cstheme="minorBidi"/>
               <w:noProof/>
+              <w:color w:val="auto"/>
+              <w:kern w:val="2"/>
+              <w14:ligatures w14:val="standardContextual"/>
             </w:rPr>
           </w:pPr>
-          <w:hyperlink w:anchor="_Toc240219616" w:history="1">
+          <w:hyperlink w:anchor="_Toc240223127" w:history="1">
             <w:r>
               <w:rPr>
                 <w:rStyle w:val="Hyperlink"/>
@@ -1160,7 +1194,7 @@
                 <w:noProof/>
                 <w:webHidden/>
               </w:rPr>
-              <w:instrText xml:space="preserve"> PAGEREF _Toc240219616 \h </w:instrText>
+              <w:instrText xml:space="preserve"> PAGEREF _Toc240223127 \h </w:instrText>
             </w:r>
             <w:r>
               <w:rPr>
@@ -1180,7 +1214,7 @@
                 <w:noProof/>
                 <w:webHidden/>
               </w:rPr>
-              <w:t>7</w:t>
+              <w:t>8</w:t>
             </w:r>
             <w:r>
               <w:rPr>
@@ -1198,10 +1232,14 @@
               <w:tab w:val="right" w:leader="dot" w:pos="9061"/>
             </w:tabs>
             <w:rPr>
+              <w:rFonts w:asciiTheme="minorHAnsi" w:eastAsiaTheme="minorEastAsia" w:hAnsiTheme="minorHAnsi" w:cstheme="minorBidi"/>
               <w:noProof/>
+              <w:color w:val="auto"/>
+              <w:kern w:val="2"/>
+              <w14:ligatures w14:val="standardContextual"/>
             </w:rPr>
           </w:pPr>
-          <w:hyperlink w:anchor="_Toc240219617" w:history="1">
+          <w:hyperlink w:anchor="_Toc240223128" w:history="1">
             <w:r>
               <w:rPr>
                 <w:rStyle w:val="Hyperlink"/>
@@ -1228,7 +1266,7 @@
                 <w:noProof/>
                 <w:webHidden/>
               </w:rPr>
-              <w:instrText xml:space="preserve"> PAGEREF _Toc240219617 \h </w:instrText>
+              <w:instrText xml:space="preserve"> PAGEREF _Toc240223128 \h </w:instrText>
             </w:r>
             <w:r>
               <w:rPr>
@@ -1248,7 +1286,7 @@
                 <w:noProof/>
                 <w:webHidden/>
               </w:rPr>
-              <w:t>8</w:t>
+              <w:t>9</w:t>
             </w:r>
             <w:r>
               <w:rPr>
@@ -1266,10 +1304,14 @@
               <w:tab w:val="right" w:leader="dot" w:pos="9061"/>
             </w:tabs>
             <w:rPr>
+              <w:rFonts w:asciiTheme="minorHAnsi" w:eastAsiaTheme="minorEastAsia" w:hAnsiTheme="minorHAnsi" w:cstheme="minorBidi"/>
               <w:noProof/>
+              <w:color w:val="auto"/>
+              <w:kern w:val="2"/>
+              <w14:ligatures w14:val="standardContextual"/>
             </w:rPr>
           </w:pPr>
-          <w:hyperlink w:anchor="_Toc240219618" w:history="1">
+          <w:hyperlink w:anchor="_Toc240223129" w:history="1">
             <w:r>
               <w:rPr>
                 <w:rStyle w:val="Hyperlink"/>
@@ -1297,7 +1339,7 @@
                 <w:noProof/>
                 <w:webHidden/>
               </w:rPr>
-              <w:instrText xml:space="preserve"> PAGEREF _Toc240219618 \h </w:instrText>
+              <w:instrText xml:space="preserve"> PAGEREF _Toc240223129 \h </w:instrText>
             </w:r>
             <w:r>
               <w:rPr>
@@ -1317,7 +1359,7 @@
                 <w:noProof/>
                 <w:webHidden/>
               </w:rPr>
-              <w:t>9</w:t>
+              <w:t>10</w:t>
             </w:r>
             <w:r>
               <w:rPr>
@@ -1335,10 +1377,14 @@
               <w:tab w:val="right" w:leader="dot" w:pos="9061"/>
             </w:tabs>
             <w:rPr>
+              <w:rFonts w:asciiTheme="minorHAnsi" w:eastAsiaTheme="minorEastAsia" w:hAnsiTheme="minorHAnsi" w:cstheme="minorBidi"/>
               <w:noProof/>
+              <w:color w:val="auto"/>
+              <w:kern w:val="2"/>
+              <w14:ligatures w14:val="standardContextual"/>
             </w:rPr>
           </w:pPr>
-          <w:hyperlink w:anchor="_Toc240219619" w:history="1">
+          <w:hyperlink w:anchor="_Toc240223130" w:history="1">
             <w:r>
               <w:rPr>
                 <w:rStyle w:val="Hyperlink"/>
@@ -1366,7 +1412,7 @@
                 <w:noProof/>
                 <w:webHidden/>
               </w:rPr>
-              <w:instrText xml:space="preserve"> PAGEREF _Toc240219619 \h </w:instrText>
+              <w:instrText xml:space="preserve"> PAGEREF _Toc240223130 \h </w:instrText>
             </w:r>
             <w:r>
               <w:rPr>
@@ -1386,7 +1432,7 @@
                 <w:noProof/>
                 <w:webHidden/>
               </w:rPr>
-              <w:t>10</w:t>
+              <w:t>11</w:t>
             </w:r>
             <w:r>
               <w:rPr>
@@ -1404,10 +1450,14 @@
               <w:tab w:val="right" w:leader="dot" w:pos="9061"/>
             </w:tabs>
             <w:rPr>
+              <w:rFonts w:asciiTheme="minorHAnsi" w:eastAsiaTheme="minorEastAsia" w:hAnsiTheme="minorHAnsi" w:cstheme="minorBidi"/>
               <w:noProof/>
+              <w:color w:val="auto"/>
+              <w:kern w:val="2"/>
+              <w14:ligatures w14:val="standardContextual"/>
             </w:rPr>
           </w:pPr>
-          <w:hyperlink w:anchor="_Toc240219620" w:history="1">
+          <w:hyperlink w:anchor="_Toc240223131" w:history="1">
             <w:r>
               <w:rPr>
                 <w:rStyle w:val="Hyperlink"/>
@@ -1435,7 +1485,7 @@
                 <w:noProof/>
                 <w:webHidden/>
               </w:rPr>
-              <w:instrText xml:space="preserve"> PAGEREF _Toc240219620 \h </w:instrText>
+              <w:instrText xml:space="preserve"> PAGEREF _Toc240223131 \h </w:instrText>
             </w:r>
             <w:r>
               <w:rPr>
@@ -1455,7 +1505,7 @@
                 <w:noProof/>
                 <w:webHidden/>
               </w:rPr>
-              <w:t>10</w:t>
+              <w:t>11</w:t>
             </w:r>
             <w:r>
               <w:rPr>
@@ -1473,10 +1523,14 @@
               <w:tab w:val="right" w:leader="dot" w:pos="9061"/>
             </w:tabs>
             <w:rPr>
+              <w:rFonts w:asciiTheme="minorHAnsi" w:eastAsiaTheme="minorEastAsia" w:hAnsiTheme="minorHAnsi" w:cstheme="minorBidi"/>
               <w:noProof/>
+              <w:color w:val="auto"/>
+              <w:kern w:val="2"/>
+              <w14:ligatures w14:val="standardContextual"/>
             </w:rPr>
           </w:pPr>
-          <w:hyperlink w:anchor="_Toc240219621" w:history="1">
+          <w:hyperlink w:anchor="_Toc240223132" w:history="1">
             <w:r>
               <w:rPr>
                 <w:rStyle w:val="Hyperlink"/>
@@ -1504,7 +1558,7 @@
                 <w:noProof/>
                 <w:webHidden/>
               </w:rPr>
-              <w:instrText xml:space="preserve"> PAGEREF _Toc240219621 \h </w:instrText>
+              <w:instrText xml:space="preserve"> PAGEREF _Toc240223132 \h </w:instrText>
             </w:r>
             <w:r>
               <w:rPr>
@@ -1524,7 +1578,7 @@
                 <w:noProof/>
                 <w:webHidden/>
               </w:rPr>
-              <w:t>11</w:t>
+              <w:t>12</w:t>
             </w:r>
             <w:r>
               <w:rPr>
@@ -1542,10 +1596,14 @@
               <w:tab w:val="right" w:leader="dot" w:pos="9061"/>
             </w:tabs>
             <w:rPr>
+              <w:rFonts w:asciiTheme="minorHAnsi" w:eastAsiaTheme="minorEastAsia" w:hAnsiTheme="minorHAnsi" w:cstheme="minorBidi"/>
               <w:noProof/>
+              <w:color w:val="auto"/>
+              <w:kern w:val="2"/>
+              <w14:ligatures w14:val="standardContextual"/>
             </w:rPr>
           </w:pPr>
-          <w:hyperlink w:anchor="_Toc240219622" w:history="1">
+          <w:hyperlink w:anchor="_Toc240223133" w:history="1">
             <w:r>
               <w:rPr>
                 <w:rStyle w:val="Hyperlink"/>
@@ -1573,7 +1631,7 @@
                 <w:noProof/>
                 <w:webHidden/>
               </w:rPr>
-              <w:instrText xml:space="preserve"> PAGEREF _Toc240219622 \h </w:instrText>
+              <w:instrText xml:space="preserve"> PAGEREF _Toc240223133 \h </w:instrText>
             </w:r>
             <w:r>
               <w:rPr>
@@ -1593,7 +1651,7 @@
                 <w:noProof/>
                 <w:webHidden/>
               </w:rPr>
-              <w:t>13</w:t>
+              <w:t>14</w:t>
             </w:r>
             <w:r>
               <w:rPr>
@@ -1611,10 +1669,14 @@
               <w:tab w:val="right" w:leader="dot" w:pos="9061"/>
             </w:tabs>
             <w:rPr>
+              <w:rFonts w:asciiTheme="minorHAnsi" w:eastAsiaTheme="minorEastAsia" w:hAnsiTheme="minorHAnsi" w:cstheme="minorBidi"/>
               <w:noProof/>
+              <w:color w:val="auto"/>
+              <w:kern w:val="2"/>
+              <w14:ligatures w14:val="standardContextual"/>
             </w:rPr>
           </w:pPr>
-          <w:hyperlink w:anchor="_Toc240219623" w:history="1">
+          <w:hyperlink w:anchor="_Toc240223134" w:history="1">
             <w:r>
               <w:rPr>
                 <w:rStyle w:val="Hyperlink"/>
@@ -1642,7 +1704,7 @@
                 <w:noProof/>
                 <w:webHidden/>
               </w:rPr>
-              <w:instrText xml:space="preserve"> PAGEREF _Toc240219623 \h </w:instrText>
+              <w:instrText xml:space="preserve"> PAGEREF _Toc240223134 \h </w:instrText>
             </w:r>
             <w:r>
               <w:rPr>
@@ -1662,7 +1724,7 @@
                 <w:noProof/>
                 <w:webHidden/>
               </w:rPr>
-              <w:t>16</w:t>
+              <w:t>17</w:t>
             </w:r>
             <w:r>
               <w:rPr>
@@ -1680,10 +1742,14 @@
               <w:tab w:val="right" w:leader="dot" w:pos="9061"/>
             </w:tabs>
             <w:rPr>
+              <w:rFonts w:asciiTheme="minorHAnsi" w:eastAsiaTheme="minorEastAsia" w:hAnsiTheme="minorHAnsi" w:cstheme="minorBidi"/>
               <w:noProof/>
+              <w:color w:val="auto"/>
+              <w:kern w:val="2"/>
+              <w14:ligatures w14:val="standardContextual"/>
             </w:rPr>
           </w:pPr>
-          <w:hyperlink w:anchor="_Toc240219624" w:history="1">
+          <w:hyperlink w:anchor="_Toc240223135" w:history="1">
             <w:r>
               <w:rPr>
                 <w:rStyle w:val="Hyperlink"/>
@@ -1711,7 +1777,7 @@
                 <w:noProof/>
                 <w:webHidden/>
               </w:rPr>
-              <w:instrText xml:space="preserve"> PAGEREF _Toc240219624 \h </w:instrText>
+              <w:instrText xml:space="preserve"> PAGEREF _Toc240223135 \h </w:instrText>
             </w:r>
             <w:r>
               <w:rPr>
@@ -1731,7 +1797,7 @@
                 <w:noProof/>
                 <w:webHidden/>
               </w:rPr>
-              <w:t>16</w:t>
+              <w:t>17</w:t>
             </w:r>
             <w:r>
               <w:rPr>
@@ -1749,10 +1815,14 @@
               <w:tab w:val="right" w:leader="dot" w:pos="9061"/>
             </w:tabs>
             <w:rPr>
+              <w:rFonts w:asciiTheme="minorHAnsi" w:eastAsiaTheme="minorEastAsia" w:hAnsiTheme="minorHAnsi" w:cstheme="minorBidi"/>
               <w:noProof/>
+              <w:color w:val="auto"/>
+              <w:kern w:val="2"/>
+              <w14:ligatures w14:val="standardContextual"/>
             </w:rPr>
           </w:pPr>
-          <w:hyperlink w:anchor="_Toc240219625" w:history="1">
+          <w:hyperlink w:anchor="_Toc240223136" w:history="1">
             <w:r>
               <w:rPr>
                 <w:rStyle w:val="Hyperlink"/>
@@ -1780,7 +1850,7 @@
                 <w:noProof/>
                 <w:webHidden/>
               </w:rPr>
-              <w:instrText xml:space="preserve"> PAGEREF _Toc240219625 \h </w:instrText>
+              <w:instrText xml:space="preserve"> PAGEREF _Toc240223136 \h </w:instrText>
             </w:r>
             <w:r>
               <w:rPr>
@@ -1800,7 +1870,7 @@
                 <w:noProof/>
                 <w:webHidden/>
               </w:rPr>
-              <w:t>17</w:t>
+              <w:t>18</w:t>
             </w:r>
             <w:r>
               <w:rPr>
@@ -1818,10 +1888,14 @@
               <w:tab w:val="right" w:leader="dot" w:pos="9061"/>
             </w:tabs>
             <w:rPr>
+              <w:rFonts w:asciiTheme="minorHAnsi" w:eastAsiaTheme="minorEastAsia" w:hAnsiTheme="minorHAnsi" w:cstheme="minorBidi"/>
               <w:noProof/>
+              <w:color w:val="auto"/>
+              <w:kern w:val="2"/>
+              <w14:ligatures w14:val="standardContextual"/>
             </w:rPr>
           </w:pPr>
-          <w:hyperlink w:anchor="_Toc240219626" w:history="1">
+          <w:hyperlink w:anchor="_Toc240223137" w:history="1">
             <w:r>
               <w:rPr>
                 <w:rStyle w:val="Hyperlink"/>
@@ -1849,7 +1923,7 @@
                 <w:noProof/>
                 <w:webHidden/>
               </w:rPr>
-              <w:instrText xml:space="preserve"> PAGEREF _Toc240219626 \h </w:instrText>
+              <w:instrText xml:space="preserve"> PAGEREF _Toc240223137 \h </w:instrText>
             </w:r>
             <w:r>
               <w:rPr>
@@ -1869,7 +1943,7 @@
                 <w:noProof/>
                 <w:webHidden/>
               </w:rPr>
-              <w:t>18</w:t>
+              <w:t>19</w:t>
             </w:r>
             <w:r>
               <w:rPr>
@@ -1887,10 +1961,14 @@
               <w:tab w:val="right" w:leader="dot" w:pos="9061"/>
             </w:tabs>
             <w:rPr>
+              <w:rFonts w:asciiTheme="minorHAnsi" w:eastAsiaTheme="minorEastAsia" w:hAnsiTheme="minorHAnsi" w:cstheme="minorBidi"/>
               <w:noProof/>
+              <w:color w:val="auto"/>
+              <w:kern w:val="2"/>
+              <w14:ligatures w14:val="standardContextual"/>
             </w:rPr>
           </w:pPr>
-          <w:hyperlink w:anchor="_Toc240219627" w:history="1">
+          <w:hyperlink w:anchor="_Toc240223138" w:history="1">
             <w:r>
               <w:rPr>
                 <w:rStyle w:val="Hyperlink"/>
@@ -1917,7 +1995,7 @@
                 <w:noProof/>
                 <w:webHidden/>
               </w:rPr>
-              <w:instrText xml:space="preserve"> PAGEREF _Toc240219627 \h </w:instrText>
+              <w:instrText xml:space="preserve"> PAGEREF _Toc240223138 \h </w:instrText>
             </w:r>
             <w:r>
               <w:rPr>
@@ -1937,7 +2015,7 @@
                 <w:noProof/>
                 <w:webHidden/>
               </w:rPr>
-              <w:t>22</w:t>
+              <w:t>23</w:t>
             </w:r>
             <w:r>
               <w:rPr>
@@ -1955,10 +2033,14 @@
               <w:tab w:val="right" w:leader="dot" w:pos="9061"/>
             </w:tabs>
             <w:rPr>
+              <w:rFonts w:asciiTheme="minorHAnsi" w:eastAsiaTheme="minorEastAsia" w:hAnsiTheme="minorHAnsi" w:cstheme="minorBidi"/>
               <w:noProof/>
+              <w:color w:val="auto"/>
+              <w:kern w:val="2"/>
+              <w14:ligatures w14:val="standardContextual"/>
             </w:rPr>
           </w:pPr>
-          <w:hyperlink w:anchor="_Toc240219628" w:history="1">
+          <w:hyperlink w:anchor="_Toc240223139" w:history="1">
             <w:r>
               <w:rPr>
                 <w:rStyle w:val="Hyperlink"/>
@@ -1986,7 +2068,7 @@
                 <w:noProof/>
                 <w:webHidden/>
               </w:rPr>
-              <w:instrText xml:space="preserve"> PAGEREF _Toc240219628 \h </w:instrText>
+              <w:instrText xml:space="preserve"> PAGEREF _Toc240223139 \h </w:instrText>
             </w:r>
             <w:r>
               <w:rPr>
@@ -2006,7 +2088,7 @@
                 <w:noProof/>
                 <w:webHidden/>
               </w:rPr>
-              <w:t>23</w:t>
+              <w:t>24</w:t>
             </w:r>
             <w:r>
               <w:rPr>
@@ -2024,10 +2106,14 @@
               <w:tab w:val="right" w:leader="dot" w:pos="9061"/>
             </w:tabs>
             <w:rPr>
+              <w:rFonts w:asciiTheme="minorHAnsi" w:eastAsiaTheme="minorEastAsia" w:hAnsiTheme="minorHAnsi" w:cstheme="minorBidi"/>
               <w:noProof/>
+              <w:color w:val="auto"/>
+              <w:kern w:val="2"/>
+              <w14:ligatures w14:val="standardContextual"/>
             </w:rPr>
           </w:pPr>
-          <w:hyperlink w:anchor="_Toc240219629" w:history="1">
+          <w:hyperlink w:anchor="_Toc240223140" w:history="1">
             <w:r>
               <w:rPr>
                 <w:rStyle w:val="Hyperlink"/>
@@ -2055,7 +2141,7 @@
                 <w:noProof/>
                 <w:webHidden/>
               </w:rPr>
-              <w:instrText xml:space="preserve"> PAGEREF _Toc240219629 \h </w:instrText>
+              <w:instrText xml:space="preserve"> PAGEREF _Toc240223140 \h </w:instrText>
             </w:r>
             <w:r>
               <w:rPr>
@@ -2075,7 +2161,7 @@
                 <w:noProof/>
                 <w:webHidden/>
               </w:rPr>
-              <w:t>23</w:t>
+              <w:t>24</w:t>
             </w:r>
             <w:r>
               <w:rPr>
@@ -2093,10 +2179,14 @@
               <w:tab w:val="right" w:leader="dot" w:pos="9061"/>
             </w:tabs>
             <w:rPr>
+              <w:rFonts w:asciiTheme="minorHAnsi" w:eastAsiaTheme="minorEastAsia" w:hAnsiTheme="minorHAnsi" w:cstheme="minorBidi"/>
               <w:noProof/>
+              <w:color w:val="auto"/>
+              <w:kern w:val="2"/>
+              <w14:ligatures w14:val="standardContextual"/>
             </w:rPr>
           </w:pPr>
-          <w:hyperlink w:anchor="_Toc240219630" w:history="1">
+          <w:hyperlink w:anchor="_Toc240223141" w:history="1">
             <w:r>
               <w:rPr>
                 <w:rStyle w:val="Hyperlink"/>
@@ -2124,7 +2214,7 @@
                 <w:noProof/>
                 <w:webHidden/>
               </w:rPr>
-              <w:instrText xml:space="preserve"> PAGEREF _Toc240219630 \h </w:instrText>
+              <w:instrText xml:space="preserve"> PAGEREF _Toc240223141 \h </w:instrText>
             </w:r>
             <w:r>
               <w:rPr>
@@ -2144,7 +2234,7 @@
                 <w:noProof/>
                 <w:webHidden/>
               </w:rPr>
-              <w:t>23</w:t>
+              <w:t>24</w:t>
             </w:r>
             <w:r>
               <w:rPr>
@@ -2162,10 +2252,14 @@
               <w:tab w:val="right" w:leader="dot" w:pos="9061"/>
             </w:tabs>
             <w:rPr>
+              <w:rFonts w:asciiTheme="minorHAnsi" w:eastAsiaTheme="minorEastAsia" w:hAnsiTheme="minorHAnsi" w:cstheme="minorBidi"/>
               <w:noProof/>
+              <w:color w:val="auto"/>
+              <w:kern w:val="2"/>
+              <w14:ligatures w14:val="standardContextual"/>
             </w:rPr>
           </w:pPr>
-          <w:hyperlink w:anchor="_Toc240219631" w:history="1">
+          <w:hyperlink w:anchor="_Toc240223142" w:history="1">
             <w:r>
               <w:rPr>
                 <w:rStyle w:val="Hyperlink"/>
@@ -2193,7 +2287,7 @@
                 <w:noProof/>
                 <w:webHidden/>
               </w:rPr>
-              <w:instrText xml:space="preserve"> PAGEREF _Toc240219631 \h </w:instrText>
+              <w:instrText xml:space="preserve"> PAGEREF _Toc240223142 \h </w:instrText>
             </w:r>
             <w:r>
               <w:rPr>
@@ -2213,7 +2307,7 @@
                 <w:noProof/>
                 <w:webHidden/>
               </w:rPr>
-              <w:t>24</w:t>
+              <w:t>25</w:t>
             </w:r>
             <w:r>
               <w:rPr>
@@ -2231,10 +2325,14 @@
               <w:tab w:val="right" w:leader="dot" w:pos="9061"/>
             </w:tabs>
             <w:rPr>
+              <w:rFonts w:asciiTheme="minorHAnsi" w:eastAsiaTheme="minorEastAsia" w:hAnsiTheme="minorHAnsi" w:cstheme="minorBidi"/>
               <w:noProof/>
+              <w:color w:val="auto"/>
+              <w:kern w:val="2"/>
+              <w14:ligatures w14:val="standardContextual"/>
             </w:rPr>
           </w:pPr>
-          <w:hyperlink w:anchor="_Toc240219632" w:history="1">
+          <w:hyperlink w:anchor="_Toc240223143" w:history="1">
             <w:r>
               <w:rPr>
                 <w:rStyle w:val="Hyperlink"/>
@@ -2262,7 +2360,7 @@
                 <w:noProof/>
                 <w:webHidden/>
               </w:rPr>
-              <w:instrText xml:space="preserve"> PAGEREF _Toc240219632 \h </w:instrText>
+              <w:instrText xml:space="preserve"> PAGEREF _Toc240223143 \h </w:instrText>
             </w:r>
             <w:r>
               <w:rPr>
@@ -2282,7 +2380,7 @@
                 <w:noProof/>
                 <w:webHidden/>
               </w:rPr>
-              <w:t>25</w:t>
+              <w:t>26</w:t>
             </w:r>
             <w:r>
               <w:rPr>
@@ -2300,10 +2398,14 @@
               <w:tab w:val="right" w:leader="dot" w:pos="9061"/>
             </w:tabs>
             <w:rPr>
+              <w:rFonts w:asciiTheme="minorHAnsi" w:eastAsiaTheme="minorEastAsia" w:hAnsiTheme="minorHAnsi" w:cstheme="minorBidi"/>
               <w:noProof/>
+              <w:color w:val="auto"/>
+              <w:kern w:val="2"/>
+              <w14:ligatures w14:val="standardContextual"/>
             </w:rPr>
           </w:pPr>
-          <w:hyperlink w:anchor="_Toc240219633" w:history="1">
+          <w:hyperlink w:anchor="_Toc240223144" w:history="1">
             <w:r>
               <w:rPr>
                 <w:rStyle w:val="Hyperlink"/>
@@ -2331,7 +2433,7 @@
                 <w:noProof/>
                 <w:webHidden/>
               </w:rPr>
-              <w:instrText xml:space="preserve"> PAGEREF _Toc240219633 \h </w:instrText>
+              <w:instrText xml:space="preserve"> PAGEREF _Toc240223144 \h </w:instrText>
             </w:r>
             <w:r>
               <w:rPr>
@@ -2351,7 +2453,7 @@
                 <w:noProof/>
                 <w:webHidden/>
               </w:rPr>
-              <w:t>27</w:t>
+              <w:t>28</w:t>
             </w:r>
             <w:r>
               <w:rPr>
@@ -2369,10 +2471,14 @@
               <w:tab w:val="right" w:leader="dot" w:pos="9061"/>
             </w:tabs>
             <w:rPr>
+              <w:rFonts w:asciiTheme="minorHAnsi" w:eastAsiaTheme="minorEastAsia" w:hAnsiTheme="minorHAnsi" w:cstheme="minorBidi"/>
               <w:noProof/>
+              <w:color w:val="auto"/>
+              <w:kern w:val="2"/>
+              <w14:ligatures w14:val="standardContextual"/>
             </w:rPr>
           </w:pPr>
-          <w:hyperlink w:anchor="_Toc240219634" w:history="1">
+          <w:hyperlink w:anchor="_Toc240223145" w:history="1">
             <w:r>
               <w:rPr>
                 <w:rStyle w:val="Hyperlink"/>
@@ -2400,7 +2506,7 @@
                 <w:noProof/>
                 <w:webHidden/>
               </w:rPr>
-              <w:instrText xml:space="preserve"> PAGEREF _Toc240219634 \h </w:instrText>
+              <w:instrText xml:space="preserve"> PAGEREF _Toc240223145 \h </w:instrText>
             </w:r>
             <w:r>
               <w:rPr>
@@ -2420,7 +2526,7 @@
                 <w:noProof/>
                 <w:webHidden/>
               </w:rPr>
-              <w:t>28</w:t>
+              <w:t>29</w:t>
             </w:r>
             <w:r>
               <w:rPr>
@@ -2438,17 +2544,37 @@
               <w:tab w:val="right" w:leader="dot" w:pos="9061"/>
             </w:tabs>
             <w:rPr>
+              <w:rFonts w:asciiTheme="minorHAnsi" w:eastAsiaTheme="minorEastAsia" w:hAnsiTheme="minorHAnsi" w:cstheme="minorBidi"/>
               <w:noProof/>
+              <w:color w:val="auto"/>
+              <w:kern w:val="2"/>
+              <w14:ligatures w14:val="standardContextual"/>
             </w:rPr>
           </w:pPr>
-          <w:hyperlink w:anchor="_Toc240219635" w:history="1">
+          <w:hyperlink w:anchor="_Toc240223146" w:history="1">
             <w:r>
               <w:rPr>
                 <w:rStyle w:val="Hyperlink"/>
                 <w:noProof/>
                 <w:lang w:val="pt-BR"/>
               </w:rPr>
-              <w:t>7.3.2 Dimensionamento fotométrico da bancada</w:t>
+              <w:t>7.3.2 Dimensionamento fo</w:t>
+            </w:r>
+            <w:r>
+              <w:rPr>
+                <w:rStyle w:val="Hyperlink"/>
+                <w:noProof/>
+                <w:lang w:val="pt-BR"/>
+              </w:rPr>
+              <w:t>t</w:t>
+            </w:r>
+            <w:r>
+              <w:rPr>
+                <w:rStyle w:val="Hyperlink"/>
+                <w:noProof/>
+                <w:lang w:val="pt-BR"/>
+              </w:rPr>
+              <w:t>ométrico da bancada</w:t>
             </w:r>
             <w:r>
               <w:rPr>
@@ -2469,7 +2595,7 @@
                 <w:noProof/>
                 <w:webHidden/>
               </w:rPr>
-              <w:instrText xml:space="preserve"> PAGEREF _Toc240219635 \h </w:instrText>
+              <w:instrText xml:space="preserve"> PAGEREF _Toc240223146 \h </w:instrText>
             </w:r>
             <w:r>
               <w:rPr>
@@ -2489,7 +2615,7 @@
                 <w:noProof/>
                 <w:webHidden/>
               </w:rPr>
-              <w:t>31</w:t>
+              <w:t>32</w:t>
             </w:r>
             <w:r>
               <w:rPr>
@@ -2507,10 +2633,14 @@
               <w:tab w:val="right" w:leader="dot" w:pos="9061"/>
             </w:tabs>
             <w:rPr>
+              <w:rFonts w:asciiTheme="minorHAnsi" w:eastAsiaTheme="minorEastAsia" w:hAnsiTheme="minorHAnsi" w:cstheme="minorBidi"/>
               <w:noProof/>
+              <w:color w:val="auto"/>
+              <w:kern w:val="2"/>
+              <w14:ligatures w14:val="standardContextual"/>
             </w:rPr>
           </w:pPr>
-          <w:hyperlink w:anchor="_Toc240219636" w:history="1">
+          <w:hyperlink w:anchor="_Toc240223147" w:history="1">
             <w:r>
               <w:rPr>
                 <w:rStyle w:val="Hyperlink"/>
@@ -2538,7 +2668,7 @@
                 <w:noProof/>
                 <w:webHidden/>
               </w:rPr>
-              <w:instrText xml:space="preserve"> PAGEREF _Toc240219636 \h </w:instrText>
+              <w:instrText xml:space="preserve"> PAGEREF _Toc240223147 \h </w:instrText>
             </w:r>
             <w:r>
               <w:rPr>
@@ -2558,7 +2688,7 @@
                 <w:noProof/>
                 <w:webHidden/>
               </w:rPr>
-              <w:t>33</w:t>
+              <w:t>34</w:t>
             </w:r>
             <w:r>
               <w:rPr>
@@ -2576,10 +2706,14 @@
               <w:tab w:val="right" w:leader="dot" w:pos="9061"/>
             </w:tabs>
             <w:rPr>
+              <w:rFonts w:asciiTheme="minorHAnsi" w:eastAsiaTheme="minorEastAsia" w:hAnsiTheme="minorHAnsi" w:cstheme="minorBidi"/>
               <w:noProof/>
+              <w:color w:val="auto"/>
+              <w:kern w:val="2"/>
+              <w14:ligatures w14:val="standardContextual"/>
             </w:rPr>
           </w:pPr>
-          <w:hyperlink w:anchor="_Toc240219637" w:history="1">
+          <w:hyperlink w:anchor="_Toc240223148" w:history="1">
             <w:r>
               <w:rPr>
                 <w:rStyle w:val="Hyperlink"/>
@@ -2607,7 +2741,7 @@
                 <w:noProof/>
                 <w:webHidden/>
               </w:rPr>
-              <w:instrText xml:space="preserve"> PAGEREF _Toc240219637 \h </w:instrText>
+              <w:instrText xml:space="preserve"> PAGEREF _Toc240223148 \h </w:instrText>
             </w:r>
             <w:r>
               <w:rPr>
@@ -2627,7 +2761,7 @@
                 <w:noProof/>
                 <w:webHidden/>
               </w:rPr>
-              <w:t>34</w:t>
+              <w:t>35</w:t>
             </w:r>
             <w:r>
               <w:rPr>
@@ -2645,10 +2779,14 @@
               <w:tab w:val="right" w:leader="dot" w:pos="9061"/>
             </w:tabs>
             <w:rPr>
+              <w:rFonts w:asciiTheme="minorHAnsi" w:eastAsiaTheme="minorEastAsia" w:hAnsiTheme="minorHAnsi" w:cstheme="minorBidi"/>
               <w:noProof/>
+              <w:color w:val="auto"/>
+              <w:kern w:val="2"/>
+              <w14:ligatures w14:val="standardContextual"/>
             </w:rPr>
           </w:pPr>
-          <w:hyperlink w:anchor="_Toc240219638" w:history="1">
+          <w:hyperlink w:anchor="_Toc240223149" w:history="1">
             <w:r>
               <w:rPr>
                 <w:rStyle w:val="Hyperlink"/>
@@ -2676,7 +2814,7 @@
                 <w:noProof/>
                 <w:webHidden/>
               </w:rPr>
-              <w:instrText xml:space="preserve"> PAGEREF _Toc240219638 \h </w:instrText>
+              <w:instrText xml:space="preserve"> PAGEREF _Toc240223149 \h </w:instrText>
             </w:r>
             <w:r>
               <w:rPr>
@@ -2696,7 +2834,7 @@
                 <w:noProof/>
                 <w:webHidden/>
               </w:rPr>
-              <w:t>35</w:t>
+              <w:t>36</w:t>
             </w:r>
             <w:r>
               <w:rPr>
@@ -2714,10 +2852,14 @@
               <w:tab w:val="right" w:leader="dot" w:pos="9061"/>
             </w:tabs>
             <w:rPr>
+              <w:rFonts w:asciiTheme="minorHAnsi" w:eastAsiaTheme="minorEastAsia" w:hAnsiTheme="minorHAnsi" w:cstheme="minorBidi"/>
               <w:noProof/>
+              <w:color w:val="auto"/>
+              <w:kern w:val="2"/>
+              <w14:ligatures w14:val="standardContextual"/>
             </w:rPr>
           </w:pPr>
-          <w:hyperlink w:anchor="_Toc240219639" w:history="1">
+          <w:hyperlink w:anchor="_Toc240223150" w:history="1">
             <w:r>
               <w:rPr>
                 <w:rStyle w:val="Hyperlink"/>
@@ -2745,7 +2887,7 @@
                 <w:noProof/>
                 <w:webHidden/>
               </w:rPr>
-              <w:instrText xml:space="preserve"> PAGEREF _Toc240219639 \h </w:instrText>
+              <w:instrText xml:space="preserve"> PAGEREF _Toc240223150 \h </w:instrText>
             </w:r>
             <w:r>
               <w:rPr>
@@ -2765,7 +2907,7 @@
                 <w:noProof/>
                 <w:webHidden/>
               </w:rPr>
-              <w:t>36</w:t>
+              <w:t>37</w:t>
             </w:r>
             <w:r>
               <w:rPr>
@@ -2783,10 +2925,14 @@
               <w:tab w:val="right" w:leader="dot" w:pos="9061"/>
             </w:tabs>
             <w:rPr>
+              <w:rFonts w:asciiTheme="minorHAnsi" w:eastAsiaTheme="minorEastAsia" w:hAnsiTheme="minorHAnsi" w:cstheme="minorBidi"/>
               <w:noProof/>
+              <w:color w:val="auto"/>
+              <w:kern w:val="2"/>
+              <w14:ligatures w14:val="standardContextual"/>
             </w:rPr>
           </w:pPr>
-          <w:hyperlink w:anchor="_Toc240219640" w:history="1">
+          <w:hyperlink w:anchor="_Toc240223151" w:history="1">
             <w:r>
               <w:rPr>
                 <w:rStyle w:val="Hyperlink"/>
@@ -2814,7 +2960,7 @@
                 <w:noProof/>
                 <w:webHidden/>
               </w:rPr>
-              <w:instrText xml:space="preserve"> PAGEREF _Toc240219640 \h </w:instrText>
+              <w:instrText xml:space="preserve"> PAGEREF _Toc240223151 \h </w:instrText>
             </w:r>
             <w:r>
               <w:rPr>
@@ -2834,7 +2980,7 @@
                 <w:noProof/>
                 <w:webHidden/>
               </w:rPr>
-              <w:t>38</w:t>
+              <w:t>39</w:t>
             </w:r>
             <w:r>
               <w:rPr>
@@ -2852,10 +2998,14 @@
               <w:tab w:val="right" w:leader="dot" w:pos="9061"/>
             </w:tabs>
             <w:rPr>
+              <w:rFonts w:asciiTheme="minorHAnsi" w:eastAsiaTheme="minorEastAsia" w:hAnsiTheme="minorHAnsi" w:cstheme="minorBidi"/>
               <w:noProof/>
+              <w:color w:val="auto"/>
+              <w:kern w:val="2"/>
+              <w14:ligatures w14:val="standardContextual"/>
             </w:rPr>
           </w:pPr>
-          <w:hyperlink w:anchor="_Toc240219641" w:history="1">
+          <w:hyperlink w:anchor="_Toc240223152" w:history="1">
             <w:r>
               <w:rPr>
                 <w:rStyle w:val="Hyperlink"/>
@@ -2883,7 +3033,7 @@
                 <w:noProof/>
                 <w:webHidden/>
               </w:rPr>
-              <w:instrText xml:space="preserve"> PAGEREF _Toc240219641 \h </w:instrText>
+              <w:instrText xml:space="preserve"> PAGEREF _Toc240223152 \h </w:instrText>
             </w:r>
             <w:r>
               <w:rPr>
@@ -2903,7 +3053,7 @@
                 <w:noProof/>
                 <w:webHidden/>
               </w:rPr>
-              <w:t>39</w:t>
+              <w:t>40</w:t>
             </w:r>
             <w:r>
               <w:rPr>
@@ -2921,10 +3071,14 @@
               <w:tab w:val="right" w:leader="dot" w:pos="9061"/>
             </w:tabs>
             <w:rPr>
+              <w:rFonts w:asciiTheme="minorHAnsi" w:eastAsiaTheme="minorEastAsia" w:hAnsiTheme="minorHAnsi" w:cstheme="minorBidi"/>
               <w:noProof/>
+              <w:color w:val="auto"/>
+              <w:kern w:val="2"/>
+              <w14:ligatures w14:val="standardContextual"/>
             </w:rPr>
           </w:pPr>
-          <w:hyperlink w:anchor="_Toc240219642" w:history="1">
+          <w:hyperlink w:anchor="_Toc240223153" w:history="1">
             <w:r>
               <w:rPr>
                 <w:rStyle w:val="Hyperlink"/>
@@ -2952,7 +3106,7 @@
                 <w:noProof/>
                 <w:webHidden/>
               </w:rPr>
-              <w:instrText xml:space="preserve"> PAGEREF _Toc240219642 \h </w:instrText>
+              <w:instrText xml:space="preserve"> PAGEREF _Toc240223153 \h </w:instrText>
             </w:r>
             <w:r>
               <w:rPr>
@@ -2972,7 +3126,7 @@
                 <w:noProof/>
                 <w:webHidden/>
               </w:rPr>
-              <w:t>40</w:t>
+              <w:t>41</w:t>
             </w:r>
             <w:r>
               <w:rPr>
@@ -2990,10 +3144,14 @@
               <w:tab w:val="right" w:leader="dot" w:pos="9061"/>
             </w:tabs>
             <w:rPr>
+              <w:rFonts w:asciiTheme="minorHAnsi" w:eastAsiaTheme="minorEastAsia" w:hAnsiTheme="minorHAnsi" w:cstheme="minorBidi"/>
               <w:noProof/>
+              <w:color w:val="auto"/>
+              <w:kern w:val="2"/>
+              <w14:ligatures w14:val="standardContextual"/>
             </w:rPr>
           </w:pPr>
-          <w:hyperlink w:anchor="_Toc240219643" w:history="1">
+          <w:hyperlink w:anchor="_Toc240223154" w:history="1">
             <w:r>
               <w:rPr>
                 <w:rStyle w:val="Hyperlink"/>
@@ -3021,7 +3179,7 @@
                 <w:noProof/>
                 <w:webHidden/>
               </w:rPr>
-              <w:instrText xml:space="preserve"> PAGEREF _Toc240219643 \h </w:instrText>
+              <w:instrText xml:space="preserve"> PAGEREF _Toc240223154 \h </w:instrText>
             </w:r>
             <w:r>
               <w:rPr>
@@ -3041,7 +3199,7 @@
                 <w:noProof/>
                 <w:webHidden/>
               </w:rPr>
-              <w:t>42</w:t>
+              <w:t>43</w:t>
             </w:r>
             <w:r>
               <w:rPr>
@@ -3059,10 +3217,14 @@
               <w:tab w:val="right" w:leader="dot" w:pos="9061"/>
             </w:tabs>
             <w:rPr>
+              <w:rFonts w:asciiTheme="minorHAnsi" w:eastAsiaTheme="minorEastAsia" w:hAnsiTheme="minorHAnsi" w:cstheme="minorBidi"/>
               <w:noProof/>
+              <w:color w:val="auto"/>
+              <w:kern w:val="2"/>
+              <w14:ligatures w14:val="standardContextual"/>
             </w:rPr>
           </w:pPr>
-          <w:hyperlink w:anchor="_Toc240219644" w:history="1">
+          <w:hyperlink w:anchor="_Toc240223155" w:history="1">
             <w:r>
               <w:rPr>
                 <w:rStyle w:val="Hyperlink"/>
@@ -3090,7 +3252,7 @@
                 <w:noProof/>
                 <w:webHidden/>
               </w:rPr>
-              <w:instrText xml:space="preserve"> PAGEREF _Toc240219644 \h </w:instrText>
+              <w:instrText xml:space="preserve"> PAGEREF _Toc240223155 \h </w:instrText>
             </w:r>
             <w:r>
               <w:rPr>
@@ -3110,7 +3272,7 @@
                 <w:noProof/>
                 <w:webHidden/>
               </w:rPr>
-              <w:t>43</w:t>
+              <w:t>44</w:t>
             </w:r>
             <w:r>
               <w:rPr>
@@ -3128,10 +3290,14 @@
               <w:tab w:val="right" w:leader="dot" w:pos="9061"/>
             </w:tabs>
             <w:rPr>
+              <w:rFonts w:asciiTheme="minorHAnsi" w:eastAsiaTheme="minorEastAsia" w:hAnsiTheme="minorHAnsi" w:cstheme="minorBidi"/>
               <w:noProof/>
+              <w:color w:val="auto"/>
+              <w:kern w:val="2"/>
+              <w14:ligatures w14:val="standardContextual"/>
             </w:rPr>
           </w:pPr>
-          <w:hyperlink w:anchor="_Toc240219645" w:history="1">
+          <w:hyperlink w:anchor="_Toc240223156" w:history="1">
             <w:r>
               <w:rPr>
                 <w:rStyle w:val="Hyperlink"/>
@@ -3159,7 +3325,7 @@
                 <w:noProof/>
                 <w:webHidden/>
               </w:rPr>
-              <w:instrText xml:space="preserve"> PAGEREF _Toc240219645 \h </w:instrText>
+              <w:instrText xml:space="preserve"> PAGEREF _Toc240223156 \h </w:instrText>
             </w:r>
             <w:r>
               <w:rPr>
@@ -3179,7 +3345,7 @@
                 <w:noProof/>
                 <w:webHidden/>
               </w:rPr>
-              <w:t>44</w:t>
+              <w:t>45</w:t>
             </w:r>
             <w:r>
               <w:rPr>
@@ -3197,10 +3363,14 @@
               <w:tab w:val="right" w:leader="dot" w:pos="9061"/>
             </w:tabs>
             <w:rPr>
+              <w:rFonts w:asciiTheme="minorHAnsi" w:eastAsiaTheme="minorEastAsia" w:hAnsiTheme="minorHAnsi" w:cstheme="minorBidi"/>
               <w:noProof/>
+              <w:color w:val="auto"/>
+              <w:kern w:val="2"/>
+              <w14:ligatures w14:val="standardContextual"/>
             </w:rPr>
           </w:pPr>
-          <w:hyperlink w:anchor="_Toc240219646" w:history="1">
+          <w:hyperlink w:anchor="_Toc240223157" w:history="1">
             <w:r>
               <w:rPr>
                 <w:rStyle w:val="Hyperlink"/>
@@ -3228,7 +3398,7 @@
                 <w:noProof/>
                 <w:webHidden/>
               </w:rPr>
-              <w:instrText xml:space="preserve"> PAGEREF _Toc240219646 \h </w:instrText>
+              <w:instrText xml:space="preserve"> PAGEREF _Toc240223157 \h </w:instrText>
             </w:r>
             <w:r>
               <w:rPr>
@@ -3248,7 +3418,7 @@
                 <w:noProof/>
                 <w:webHidden/>
               </w:rPr>
-              <w:t>46</w:t>
+              <w:t>47</w:t>
             </w:r>
             <w:r>
               <w:rPr>
@@ -3292,7 +3462,7 @@
           <w:lang w:val="pt-BR"/>
         </w:rPr>
       </w:pPr>
-      <w:bookmarkStart w:id="0" w:name="_Toc240219609"/>
+      <w:bookmarkStart w:id="0" w:name="_Toc240223120"/>
       <w:r>
         <w:rPr>
           <w:lang w:val="pt-BR"/>
@@ -3358,7 +3528,7 @@
           <w:lang w:val="pt-BR"/>
         </w:rPr>
       </w:pPr>
-      <w:bookmarkStart w:id="1" w:name="_Toc240219610"/>
+      <w:bookmarkStart w:id="1" w:name="_Toc240223121"/>
       <w:r>
         <w:rPr>
           <w:lang w:val="pt-BR"/>
@@ -3407,7 +3577,7 @@
           <w:lang w:val="pt-BR"/>
         </w:rPr>
       </w:pPr>
-      <w:bookmarkStart w:id="2" w:name="_Toc240219611"/>
+      <w:bookmarkStart w:id="2" w:name="_Toc240223122"/>
       <w:r>
         <w:rPr>
           <w:lang w:val="pt-BR"/>
@@ -3457,7 +3627,7 @@
           <w:lang w:val="pt-BR"/>
         </w:rPr>
       </w:pPr>
-      <w:bookmarkStart w:id="3" w:name="_Toc240219612"/>
+      <w:bookmarkStart w:id="3" w:name="_Toc240223123"/>
       <w:r>
         <w:rPr>
           <w:lang w:val="pt-BR"/>
@@ -3522,7 +3692,7 @@
           <w:lang w:val="pt-BR"/>
         </w:rPr>
       </w:pPr>
-      <w:bookmarkStart w:id="4" w:name="_Toc240219613"/>
+      <w:bookmarkStart w:id="4" w:name="_Toc240223124"/>
       <w:r>
         <w:rPr>
           <w:lang w:val="pt-BR"/>
@@ -3652,7 +3822,7 @@
           <w:lang w:val="pt-BR"/>
         </w:rPr>
       </w:pPr>
-      <w:bookmarkStart w:id="5" w:name="_Toc240219614"/>
+      <w:bookmarkStart w:id="5" w:name="_Toc240223125"/>
       <w:r>
         <w:rPr>
           <w:lang w:val="pt-BR"/>
@@ -3790,7 +3960,7 @@
           <w:lang w:val="pt-BR"/>
         </w:rPr>
       </w:pPr>
-      <w:bookmarkStart w:id="6" w:name="_Toc240219615"/>
+      <w:bookmarkStart w:id="6" w:name="_Toc240223126"/>
       <w:r>
         <w:rPr>
           <w:lang w:val="pt-BR"/>
@@ -3807,7 +3977,7 @@
           <w:lang w:val="pt-BR"/>
         </w:rPr>
       </w:pPr>
-      <w:bookmarkStart w:id="7" w:name="_Toc240219616"/>
+      <w:bookmarkStart w:id="7" w:name="_Toc240223127"/>
       <w:r>
         <w:rPr>
           <w:lang w:val="pt-BR"/>
@@ -3838,7 +4008,7 @@
         <w:pStyle w:val="Heading2"/>
         <w:spacing w:before="360" w:after="240" w:line="360" w:lineRule="auto"/>
       </w:pPr>
-      <w:bookmarkStart w:id="8" w:name="_Toc240219617"/>
+      <w:bookmarkStart w:id="8" w:name="_Toc240223128"/>
       <w:r>
         <w:t xml:space="preserve">4.2 </w:t>
       </w:r>
@@ -4001,7 +4171,7 @@
           <w:lang w:val="pt-BR"/>
         </w:rPr>
       </w:pPr>
-      <w:bookmarkStart w:id="9" w:name="_Toc240219618"/>
+      <w:bookmarkStart w:id="9" w:name="_Toc240223129"/>
       <w:r>
         <w:rPr>
           <w:lang w:val="pt-BR"/>
@@ -4122,7 +4292,7 @@
           <w:lang w:val="pt-BR"/>
         </w:rPr>
       </w:pPr>
-      <w:bookmarkStart w:id="10" w:name="_Toc240219619"/>
+      <w:bookmarkStart w:id="10" w:name="_Toc240223130"/>
       <w:r>
         <w:rPr>
           <w:lang w:val="pt-BR"/>
@@ -4139,7 +4309,7 @@
           <w:lang w:val="pt-BR"/>
         </w:rPr>
       </w:pPr>
-      <w:bookmarkStart w:id="11" w:name="_Toc240219620"/>
+      <w:bookmarkStart w:id="11" w:name="_Toc240223131"/>
       <w:r>
         <w:rPr>
           <w:lang w:val="pt-BR"/>
@@ -4259,7 +4429,7 @@
           <w:lang w:val="pt-BR"/>
         </w:rPr>
       </w:pPr>
-      <w:bookmarkStart w:id="12" w:name="_Toc240219621"/>
+      <w:bookmarkStart w:id="12" w:name="_Toc240223132"/>
       <w:r>
         <w:rPr>
           <w:lang w:val="pt-BR"/>
@@ -4412,7 +4582,7 @@
           <w:lang w:val="pt-BR"/>
         </w:rPr>
       </w:pPr>
-      <w:bookmarkStart w:id="13" w:name="_Toc240219622"/>
+      <w:bookmarkStart w:id="13" w:name="_Toc240223133"/>
       <w:r>
         <w:rPr>
           <w:lang w:val="pt-BR"/>
@@ -4476,12 +4646,6 @@
         <w:gridCol w:w="3771"/>
       </w:tblGrid>
       <w:tr>
-        <w:tblPrEx>
-          <w:tblCellMar>
-            <w:top w:w="0" w:type="dxa"/>
-            <w:bottom w:w="0" w:type="dxa"/>
-          </w:tblCellMar>
-        </w:tblPrEx>
         <w:trPr>
           <w:tblHeader/>
         </w:trPr>
@@ -4615,12 +4779,6 @@
         </w:tc>
       </w:tr>
       <w:tr>
-        <w:tblPrEx>
-          <w:tblCellMar>
-            <w:top w:w="0" w:type="dxa"/>
-            <w:bottom w:w="0" w:type="dxa"/>
-          </w:tblCellMar>
-        </w:tblPrEx>
         <w:tc>
           <w:tcPr>
             <w:tcW w:w="2100" w:type="dxa"/>
@@ -4720,12 +4878,6 @@
         </w:tc>
       </w:tr>
       <w:tr>
-        <w:tblPrEx>
-          <w:tblCellMar>
-            <w:top w:w="0" w:type="dxa"/>
-            <w:bottom w:w="0" w:type="dxa"/>
-          </w:tblCellMar>
-        </w:tblPrEx>
         <w:tc>
           <w:tcPr>
             <w:tcW w:w="2100" w:type="dxa"/>
@@ -4819,12 +4971,6 @@
         </w:tc>
       </w:tr>
       <w:tr>
-        <w:tblPrEx>
-          <w:tblCellMar>
-            <w:top w:w="0" w:type="dxa"/>
-            <w:bottom w:w="0" w:type="dxa"/>
-          </w:tblCellMar>
-        </w:tblPrEx>
         <w:tc>
           <w:tcPr>
             <w:tcW w:w="2100" w:type="dxa"/>
@@ -4899,12 +5045,6 @@
         </w:tc>
       </w:tr>
       <w:tr>
-        <w:tblPrEx>
-          <w:tblCellMar>
-            <w:top w:w="0" w:type="dxa"/>
-            <w:bottom w:w="0" w:type="dxa"/>
-          </w:tblCellMar>
-        </w:tblPrEx>
         <w:tc>
           <w:tcPr>
             <w:tcW w:w="2100" w:type="dxa"/>
@@ -4995,12 +5135,6 @@
         </w:tc>
       </w:tr>
       <w:tr>
-        <w:tblPrEx>
-          <w:tblCellMar>
-            <w:top w:w="0" w:type="dxa"/>
-            <w:bottom w:w="0" w:type="dxa"/>
-          </w:tblCellMar>
-        </w:tblPrEx>
         <w:tc>
           <w:tcPr>
             <w:tcW w:w="2100" w:type="dxa"/>
@@ -5244,7 +5378,7 @@
           <w:lang w:val="pt-BR"/>
         </w:rPr>
       </w:pPr>
-      <w:bookmarkStart w:id="14" w:name="_Toc240219623"/>
+      <w:bookmarkStart w:id="14" w:name="_Toc240223134"/>
       <w:r>
         <w:rPr>
           <w:lang w:val="pt-BR"/>
@@ -5293,7 +5427,7 @@
           <w:lang w:val="pt-BR"/>
         </w:rPr>
       </w:pPr>
-      <w:bookmarkStart w:id="15" w:name="_Toc240219624"/>
+      <w:bookmarkStart w:id="15" w:name="_Toc240223135"/>
       <w:r>
         <w:rPr>
           <w:lang w:val="pt-BR"/>
@@ -5429,7 +5563,7 @@
           <w:lang w:val="pt-BR"/>
         </w:rPr>
       </w:pPr>
-      <w:bookmarkStart w:id="16" w:name="_Toc240219625"/>
+      <w:bookmarkStart w:id="16" w:name="_Toc240223136"/>
       <w:r>
         <w:rPr>
           <w:lang w:val="pt-BR"/>
@@ -5533,7 +5667,7 @@
           <w:lang w:val="pt-BR"/>
         </w:rPr>
       </w:pPr>
-      <w:bookmarkStart w:id="17" w:name="_Toc240219626"/>
+      <w:bookmarkStart w:id="17" w:name="_Toc240223137"/>
       <w:r>
         <w:rPr>
           <w:lang w:val="pt-BR"/>
@@ -5701,12 +5835,6 @@
         <w:gridCol w:w="3771"/>
       </w:tblGrid>
       <w:tr>
-        <w:tblPrEx>
-          <w:tblCellMar>
-            <w:top w:w="0" w:type="dxa"/>
-            <w:bottom w:w="0" w:type="dxa"/>
-          </w:tblCellMar>
-        </w:tblPrEx>
         <w:trPr>
           <w:tblHeader/>
         </w:trPr>
@@ -5840,12 +5968,6 @@
         </w:tc>
       </w:tr>
       <w:tr>
-        <w:tblPrEx>
-          <w:tblCellMar>
-            <w:top w:w="0" w:type="dxa"/>
-            <w:bottom w:w="0" w:type="dxa"/>
-          </w:tblCellMar>
-        </w:tblPrEx>
         <w:tc>
           <w:tcPr>
             <w:tcW w:w="2100" w:type="dxa"/>
@@ -5926,12 +6048,6 @@
         </w:tc>
       </w:tr>
       <w:tr>
-        <w:tblPrEx>
-          <w:tblCellMar>
-            <w:top w:w="0" w:type="dxa"/>
-            <w:bottom w:w="0" w:type="dxa"/>
-          </w:tblCellMar>
-        </w:tblPrEx>
         <w:tc>
           <w:tcPr>
             <w:tcW w:w="2100" w:type="dxa"/>
@@ -6012,12 +6128,6 @@
         </w:tc>
       </w:tr>
       <w:tr>
-        <w:tblPrEx>
-          <w:tblCellMar>
-            <w:top w:w="0" w:type="dxa"/>
-            <w:bottom w:w="0" w:type="dxa"/>
-          </w:tblCellMar>
-        </w:tblPrEx>
         <w:tc>
           <w:tcPr>
             <w:tcW w:w="2100" w:type="dxa"/>
@@ -6098,12 +6208,6 @@
         </w:tc>
       </w:tr>
       <w:tr>
-        <w:tblPrEx>
-          <w:tblCellMar>
-            <w:top w:w="0" w:type="dxa"/>
-            <w:bottom w:w="0" w:type="dxa"/>
-          </w:tblCellMar>
-        </w:tblPrEx>
         <w:tc>
           <w:tcPr>
             <w:tcW w:w="2100" w:type="dxa"/>
@@ -6184,12 +6288,6 @@
         </w:tc>
       </w:tr>
       <w:tr>
-        <w:tblPrEx>
-          <w:tblCellMar>
-            <w:top w:w="0" w:type="dxa"/>
-            <w:bottom w:w="0" w:type="dxa"/>
-          </w:tblCellMar>
-        </w:tblPrEx>
         <w:tc>
           <w:tcPr>
             <w:tcW w:w="2100" w:type="dxa"/>
@@ -6365,12 +6463,6 @@
         </w:tc>
       </w:tr>
       <w:tr>
-        <w:tblPrEx>
-          <w:tblCellMar>
-            <w:top w:w="0" w:type="dxa"/>
-            <w:bottom w:w="0" w:type="dxa"/>
-          </w:tblCellMar>
-        </w:tblPrEx>
         <w:tc>
           <w:tcPr>
             <w:tcW w:w="2100" w:type="dxa"/>
@@ -6452,12 +6544,6 @@
         </w:tc>
       </w:tr>
       <w:tr>
-        <w:tblPrEx>
-          <w:tblCellMar>
-            <w:top w:w="0" w:type="dxa"/>
-            <w:bottom w:w="0" w:type="dxa"/>
-          </w:tblCellMar>
-        </w:tblPrEx>
         <w:tc>
           <w:tcPr>
             <w:tcW w:w="2100" w:type="dxa"/>
@@ -6479,7 +6565,15 @@
                 <w:sz w:val="20"/>
                 <w:szCs w:val="20"/>
               </w:rPr>
-              <w:t xml:space="preserve">Catlett et al. (2017); Sanchez et al. (2014). </w:t>
+              <w:t xml:space="preserve">Catlett et al. (2017); Sanchez et al. </w:t>
+            </w:r>
+            <w:r>
+              <w:rPr>
+                <w:sz w:val="20"/>
+                <w:szCs w:val="20"/>
+                <w:lang w:val="pt-BR"/>
+              </w:rPr>
+              <w:t xml:space="preserve">(2014). </w:t>
             </w:r>
             <w:r>
               <w:rPr>
@@ -6545,12 +6639,6 @@
         </w:tc>
       </w:tr>
       <w:tr>
-        <w:tblPrEx>
-          <w:tblCellMar>
-            <w:top w:w="0" w:type="dxa"/>
-            <w:bottom w:w="0" w:type="dxa"/>
-          </w:tblCellMar>
-        </w:tblPrEx>
         <w:tc>
           <w:tcPr>
             <w:tcW w:w="2100" w:type="dxa"/>
@@ -6683,12 +6771,6 @@
         </w:tc>
       </w:tr>
       <w:tr>
-        <w:tblPrEx>
-          <w:tblCellMar>
-            <w:top w:w="0" w:type="dxa"/>
-            <w:bottom w:w="0" w:type="dxa"/>
-          </w:tblCellMar>
-        </w:tblPrEx>
         <w:tc>
           <w:tcPr>
             <w:tcW w:w="2100" w:type="dxa"/>
@@ -6836,12 +6918,6 @@
         </w:tc>
       </w:tr>
       <w:tr>
-        <w:tblPrEx>
-          <w:tblCellMar>
-            <w:top w:w="0" w:type="dxa"/>
-            <w:bottom w:w="0" w:type="dxa"/>
-          </w:tblCellMar>
-        </w:tblPrEx>
         <w:tc>
           <w:tcPr>
             <w:tcW w:w="2100" w:type="dxa"/>
@@ -6922,12 +6998,6 @@
         </w:tc>
       </w:tr>
       <w:tr>
-        <w:tblPrEx>
-          <w:tblCellMar>
-            <w:top w:w="0" w:type="dxa"/>
-            <w:bottom w:w="0" w:type="dxa"/>
-          </w:tblCellMar>
-        </w:tblPrEx>
         <w:tc>
           <w:tcPr>
             <w:tcW w:w="2100" w:type="dxa"/>
@@ -7010,12 +7080,6 @@
         </w:tc>
       </w:tr>
       <w:tr>
-        <w:tblPrEx>
-          <w:tblCellMar>
-            <w:top w:w="0" w:type="dxa"/>
-            <w:bottom w:w="0" w:type="dxa"/>
-          </w:tblCellMar>
-        </w:tblPrEx>
         <w:tc>
           <w:tcPr>
             <w:tcW w:w="2100" w:type="dxa"/>
@@ -7099,12 +7163,6 @@
         </w:tc>
       </w:tr>
       <w:tr>
-        <w:tblPrEx>
-          <w:tblCellMar>
-            <w:top w:w="0" w:type="dxa"/>
-            <w:bottom w:w="0" w:type="dxa"/>
-          </w:tblCellMar>
-        </w:tblPrEx>
         <w:tc>
           <w:tcPr>
             <w:tcW w:w="2100" w:type="dxa"/>
@@ -7260,12 +7318,6 @@
         </w:tc>
       </w:tr>
       <w:tr>
-        <w:tblPrEx>
-          <w:tblCellMar>
-            <w:top w:w="0" w:type="dxa"/>
-            <w:bottom w:w="0" w:type="dxa"/>
-          </w:tblCellMar>
-        </w:tblPrEx>
         <w:tc>
           <w:tcPr>
             <w:tcW w:w="2100" w:type="dxa"/>
@@ -7473,7 +7525,7 @@
         <w:pStyle w:val="Heading2"/>
         <w:spacing w:before="360" w:after="240" w:line="360" w:lineRule="auto"/>
       </w:pPr>
-      <w:bookmarkStart w:id="18" w:name="_Toc240219627"/>
+      <w:bookmarkStart w:id="18" w:name="_Toc240223138"/>
       <w:r>
         <w:t xml:space="preserve">6.8 Lacuna </w:t>
       </w:r>
@@ -7595,7 +7647,7 @@
           <w:lang w:val="pt-BR"/>
         </w:rPr>
       </w:pPr>
-      <w:bookmarkStart w:id="19" w:name="_Toc240219628"/>
+      <w:bookmarkStart w:id="19" w:name="_Toc240223139"/>
       <w:r>
         <w:rPr>
           <w:lang w:val="pt-BR"/>
@@ -7612,7 +7664,7 @@
           <w:lang w:val="pt-BR"/>
         </w:rPr>
       </w:pPr>
-      <w:bookmarkStart w:id="20" w:name="_Toc240219629"/>
+      <w:bookmarkStart w:id="20" w:name="_Toc240223140"/>
       <w:r>
         <w:rPr>
           <w:lang w:val="pt-BR"/>
@@ -7645,7 +7697,7 @@
           <w:lang w:val="pt-BR"/>
         </w:rPr>
       </w:pPr>
-      <w:bookmarkStart w:id="21" w:name="_Toc240219630"/>
+      <w:bookmarkStart w:id="21" w:name="_Toc240223141"/>
       <w:r>
         <w:rPr>
           <w:lang w:val="pt-BR"/>
@@ -7837,7 +7889,7 @@
           <w:lang w:val="pt-BR"/>
         </w:rPr>
       </w:pPr>
-      <w:bookmarkStart w:id="22" w:name="_Toc240219631"/>
+      <w:bookmarkStart w:id="22" w:name="_Toc240223142"/>
       <w:r>
         <w:rPr>
           <w:lang w:val="pt-BR"/>
@@ -8019,7 +8071,7 @@
           <w:lang w:val="pt-BR"/>
         </w:rPr>
       </w:pPr>
-      <w:bookmarkStart w:id="23" w:name="_Toc240219632"/>
+      <w:bookmarkStart w:id="23" w:name="_Toc240223143"/>
       <w:r>
         <w:rPr>
           <w:lang w:val="pt-BR"/>
@@ -8122,12 +8174,6 @@
         <w:gridCol w:w="3771"/>
       </w:tblGrid>
       <w:tr>
-        <w:tblPrEx>
-          <w:tblCellMar>
-            <w:top w:w="0" w:type="dxa"/>
-            <w:bottom w:w="0" w:type="dxa"/>
-          </w:tblCellMar>
-        </w:tblPrEx>
         <w:trPr>
           <w:tblHeader/>
         </w:trPr>
@@ -8248,12 +8294,6 @@
         </w:tc>
       </w:tr>
       <w:tr>
-        <w:tblPrEx>
-          <w:tblCellMar>
-            <w:top w:w="0" w:type="dxa"/>
-            <w:bottom w:w="0" w:type="dxa"/>
-          </w:tblCellMar>
-        </w:tblPrEx>
         <w:tc>
           <w:tcPr>
             <w:tcW w:w="2100" w:type="dxa"/>
@@ -8330,12 +8370,6 @@
         </w:tc>
       </w:tr>
       <w:tr>
-        <w:tblPrEx>
-          <w:tblCellMar>
-            <w:top w:w="0" w:type="dxa"/>
-            <w:bottom w:w="0" w:type="dxa"/>
-          </w:tblCellMar>
-        </w:tblPrEx>
         <w:tc>
           <w:tcPr>
             <w:tcW w:w="2100" w:type="dxa"/>
@@ -8412,12 +8446,6 @@
         </w:tc>
       </w:tr>
       <w:tr>
-        <w:tblPrEx>
-          <w:tblCellMar>
-            <w:top w:w="0" w:type="dxa"/>
-            <w:bottom w:w="0" w:type="dxa"/>
-          </w:tblCellMar>
-        </w:tblPrEx>
         <w:tc>
           <w:tcPr>
             <w:tcW w:w="2100" w:type="dxa"/>
@@ -8494,12 +8522,6 @@
         </w:tc>
       </w:tr>
       <w:tr>
-        <w:tblPrEx>
-          <w:tblCellMar>
-            <w:top w:w="0" w:type="dxa"/>
-            <w:bottom w:w="0" w:type="dxa"/>
-          </w:tblCellMar>
-        </w:tblPrEx>
         <w:tc>
           <w:tcPr>
             <w:tcW w:w="2100" w:type="dxa"/>
@@ -8585,12 +8607,6 @@
         </w:tc>
       </w:tr>
       <w:tr>
-        <w:tblPrEx>
-          <w:tblCellMar>
-            <w:top w:w="0" w:type="dxa"/>
-            <w:bottom w:w="0" w:type="dxa"/>
-          </w:tblCellMar>
-        </w:tblPrEx>
         <w:tc>
           <w:tcPr>
             <w:tcW w:w="2100" w:type="dxa"/>
@@ -8668,12 +8684,6 @@
         </w:tc>
       </w:tr>
       <w:tr>
-        <w:tblPrEx>
-          <w:tblCellMar>
-            <w:top w:w="0" w:type="dxa"/>
-            <w:bottom w:w="0" w:type="dxa"/>
-          </w:tblCellMar>
-        </w:tblPrEx>
         <w:tc>
           <w:tcPr>
             <w:tcW w:w="2100" w:type="dxa"/>
@@ -8806,7 +8816,7 @@
           <w:lang w:val="pt-BR"/>
         </w:rPr>
       </w:pPr>
-      <w:bookmarkStart w:id="24" w:name="_Toc240219633"/>
+      <w:bookmarkStart w:id="24" w:name="_Toc240223144"/>
       <w:r>
         <w:rPr>
           <w:lang w:val="pt-BR"/>
@@ -8870,12 +8880,6 @@
         <w:gridCol w:w="3771"/>
       </w:tblGrid>
       <w:tr>
-        <w:tblPrEx>
-          <w:tblCellMar>
-            <w:top w:w="0" w:type="dxa"/>
-            <w:bottom w:w="0" w:type="dxa"/>
-          </w:tblCellMar>
-        </w:tblPrEx>
         <w:trPr>
           <w:tblHeader/>
         </w:trPr>
@@ -8994,12 +8998,6 @@
         </w:tc>
       </w:tr>
       <w:tr>
-        <w:tblPrEx>
-          <w:tblCellMar>
-            <w:top w:w="0" w:type="dxa"/>
-            <w:bottom w:w="0" w:type="dxa"/>
-          </w:tblCellMar>
-        </w:tblPrEx>
         <w:tc>
           <w:tcPr>
             <w:tcW w:w="2100" w:type="dxa"/>
@@ -9116,12 +9114,6 @@
         </w:tc>
       </w:tr>
       <w:tr>
-        <w:tblPrEx>
-          <w:tblCellMar>
-            <w:top w:w="0" w:type="dxa"/>
-            <w:bottom w:w="0" w:type="dxa"/>
-          </w:tblCellMar>
-        </w:tblPrEx>
         <w:tc>
           <w:tcPr>
             <w:tcW w:w="2100" w:type="dxa"/>
@@ -9309,12 +9301,6 @@
         </w:tc>
       </w:tr>
       <w:tr>
-        <w:tblPrEx>
-          <w:tblCellMar>
-            <w:top w:w="0" w:type="dxa"/>
-            <w:bottom w:w="0" w:type="dxa"/>
-          </w:tblCellMar>
-        </w:tblPrEx>
         <w:tc>
           <w:tcPr>
             <w:tcW w:w="2100" w:type="dxa"/>
@@ -9396,12 +9382,6 @@
         </w:tc>
       </w:tr>
       <w:tr>
-        <w:tblPrEx>
-          <w:tblCellMar>
-            <w:top w:w="0" w:type="dxa"/>
-            <w:bottom w:w="0" w:type="dxa"/>
-          </w:tblCellMar>
-        </w:tblPrEx>
         <w:tc>
           <w:tcPr>
             <w:tcW w:w="2100" w:type="dxa"/>
@@ -9492,12 +9472,6 @@
         </w:tc>
       </w:tr>
       <w:tr>
-        <w:tblPrEx>
-          <w:tblCellMar>
-            <w:top w:w="0" w:type="dxa"/>
-            <w:bottom w:w="0" w:type="dxa"/>
-          </w:tblCellMar>
-        </w:tblPrEx>
         <w:tc>
           <w:tcPr>
             <w:tcW w:w="2100" w:type="dxa"/>
@@ -9572,12 +9546,6 @@
         </w:tc>
       </w:tr>
       <w:tr>
-        <w:tblPrEx>
-          <w:tblCellMar>
-            <w:top w:w="0" w:type="dxa"/>
-            <w:bottom w:w="0" w:type="dxa"/>
-          </w:tblCellMar>
-        </w:tblPrEx>
         <w:tc>
           <w:tcPr>
             <w:tcW w:w="2100" w:type="dxa"/>
@@ -9710,7 +9678,7 @@
           <w:lang w:val="pt-BR"/>
         </w:rPr>
       </w:pPr>
-      <w:bookmarkStart w:id="25" w:name="_Toc240219634"/>
+      <w:bookmarkStart w:id="25" w:name="_Toc240223145"/>
       <w:r>
         <w:rPr>
           <w:lang w:val="pt-BR"/>
@@ -9775,12 +9743,6 @@
         <w:gridCol w:w="3853"/>
       </w:tblGrid>
       <w:tr>
-        <w:tblPrEx>
-          <w:tblCellMar>
-            <w:top w:w="0" w:type="dxa"/>
-            <w:bottom w:w="0" w:type="dxa"/>
-          </w:tblCellMar>
-        </w:tblPrEx>
         <w:trPr>
           <w:tblHeader/>
         </w:trPr>
@@ -9987,12 +9949,6 @@
         </w:tc>
       </w:tr>
       <w:tr>
-        <w:tblPrEx>
-          <w:tblCellMar>
-            <w:top w:w="0" w:type="dxa"/>
-            <w:bottom w:w="0" w:type="dxa"/>
-          </w:tblCellMar>
-        </w:tblPrEx>
         <w:tc>
           <w:tcPr>
             <w:tcW w:w="1450" w:type="dxa"/>
@@ -10105,12 +10061,6 @@
         </w:tc>
       </w:tr>
       <w:tr>
-        <w:tblPrEx>
-          <w:tblCellMar>
-            <w:top w:w="0" w:type="dxa"/>
-            <w:bottom w:w="0" w:type="dxa"/>
-          </w:tblCellMar>
-        </w:tblPrEx>
         <w:tc>
           <w:tcPr>
             <w:tcW w:w="1450" w:type="dxa"/>
@@ -10217,12 +10167,6 @@
         </w:tc>
       </w:tr>
       <w:tr>
-        <w:tblPrEx>
-          <w:tblCellMar>
-            <w:top w:w="0" w:type="dxa"/>
-            <w:bottom w:w="0" w:type="dxa"/>
-          </w:tblCellMar>
-        </w:tblPrEx>
         <w:tc>
           <w:tcPr>
             <w:tcW w:w="1450" w:type="dxa"/>
@@ -10323,12 +10267,6 @@
         </w:tc>
       </w:tr>
       <w:tr>
-        <w:tblPrEx>
-          <w:tblCellMar>
-            <w:top w:w="0" w:type="dxa"/>
-            <w:bottom w:w="0" w:type="dxa"/>
-          </w:tblCellMar>
-        </w:tblPrEx>
         <w:tc>
           <w:tcPr>
             <w:tcW w:w="1450" w:type="dxa"/>
@@ -10466,12 +10404,6 @@
         </w:tc>
       </w:tr>
       <w:tr>
-        <w:tblPrEx>
-          <w:tblCellMar>
-            <w:top w:w="0" w:type="dxa"/>
-            <w:bottom w:w="0" w:type="dxa"/>
-          </w:tblCellMar>
-        </w:tblPrEx>
         <w:tc>
           <w:tcPr>
             <w:tcW w:w="1450" w:type="dxa"/>
@@ -10680,7 +10612,7 @@
           <w:lang w:val="pt-BR"/>
         </w:rPr>
       </w:pPr>
-      <w:bookmarkStart w:id="26" w:name="_Toc240219635"/>
+      <w:bookmarkStart w:id="26" w:name="_Toc240223146"/>
       <w:r>
         <w:rPr>
           <w:lang w:val="pt-BR"/>
@@ -10862,12 +10794,6 @@
         <w:gridCol w:w="2471"/>
       </w:tblGrid>
       <w:tr>
-        <w:tblPrEx>
-          <w:tblCellMar>
-            <w:top w:w="0" w:type="dxa"/>
-            <w:bottom w:w="0" w:type="dxa"/>
-          </w:tblCellMar>
-        </w:tblPrEx>
         <w:trPr>
           <w:tblHeader/>
         </w:trPr>
@@ -11023,12 +10949,6 @@
         </w:tc>
       </w:tr>
       <w:tr>
-        <w:tblPrEx>
-          <w:tblCellMar>
-            <w:top w:w="0" w:type="dxa"/>
-            <w:bottom w:w="0" w:type="dxa"/>
-          </w:tblCellMar>
-        </w:tblPrEx>
         <w:tc>
           <w:tcPr>
             <w:tcW w:w="1700" w:type="dxa"/>
@@ -11135,12 +11055,6 @@
         </w:tc>
       </w:tr>
       <w:tr>
-        <w:tblPrEx>
-          <w:tblCellMar>
-            <w:top w:w="0" w:type="dxa"/>
-            <w:bottom w:w="0" w:type="dxa"/>
-          </w:tblCellMar>
-        </w:tblPrEx>
         <w:tc>
           <w:tcPr>
             <w:tcW w:w="1700" w:type="dxa"/>
@@ -11269,12 +11183,6 @@
         </w:tc>
       </w:tr>
       <w:tr>
-        <w:tblPrEx>
-          <w:tblCellMar>
-            <w:top w:w="0" w:type="dxa"/>
-            <w:bottom w:w="0" w:type="dxa"/>
-          </w:tblCellMar>
-        </w:tblPrEx>
         <w:tc>
           <w:tcPr>
             <w:tcW w:w="1700" w:type="dxa"/>
@@ -11384,12 +11292,6 @@
         </w:tc>
       </w:tr>
       <w:tr>
-        <w:tblPrEx>
-          <w:tblCellMar>
-            <w:top w:w="0" w:type="dxa"/>
-            <w:bottom w:w="0" w:type="dxa"/>
-          </w:tblCellMar>
-        </w:tblPrEx>
         <w:tc>
           <w:tcPr>
             <w:tcW w:w="1700" w:type="dxa"/>
@@ -11534,12 +11436,6 @@
         </w:tc>
       </w:tr>
       <w:tr>
-        <w:tblPrEx>
-          <w:tblCellMar>
-            <w:top w:w="0" w:type="dxa"/>
-            <w:bottom w:w="0" w:type="dxa"/>
-          </w:tblCellMar>
-        </w:tblPrEx>
         <w:tc>
           <w:tcPr>
             <w:tcW w:w="1700" w:type="dxa"/>
@@ -11735,7 +11631,7 @@
           <w:lang w:val="pt-BR"/>
         </w:rPr>
       </w:pPr>
-      <w:bookmarkStart w:id="27" w:name="_Toc240219636"/>
+      <w:bookmarkStart w:id="27" w:name="_Toc240223147"/>
       <w:r>
         <w:rPr>
           <w:lang w:val="pt-BR"/>
@@ -11791,7 +11687,7 @@
           <w:lang w:val="pt-BR"/>
         </w:rPr>
       </w:pPr>
-      <w:bookmarkStart w:id="28" w:name="_Toc240219637"/>
+      <w:bookmarkStart w:id="28" w:name="_Toc240223148"/>
       <w:r>
         <w:rPr>
           <w:lang w:val="pt-BR"/>
@@ -11927,7 +11823,7 @@
           <w:lang w:val="pt-BR"/>
         </w:rPr>
       </w:pPr>
-      <w:bookmarkStart w:id="29" w:name="_Toc240219638"/>
+      <w:bookmarkStart w:id="29" w:name="_Toc240223149"/>
       <w:r>
         <w:rPr>
           <w:lang w:val="pt-BR"/>
@@ -12025,7 +11921,7 @@
           <w:lang w:val="pt-BR"/>
         </w:rPr>
       </w:pPr>
-      <w:bookmarkStart w:id="30" w:name="_Toc240219639"/>
+      <w:bookmarkStart w:id="30" w:name="_Toc240223150"/>
       <w:r>
         <w:rPr>
           <w:lang w:val="pt-BR"/>
@@ -12089,12 +11985,6 @@
         <w:gridCol w:w="3771"/>
       </w:tblGrid>
       <w:tr>
-        <w:tblPrEx>
-          <w:tblCellMar>
-            <w:top w:w="0" w:type="dxa"/>
-            <w:bottom w:w="0" w:type="dxa"/>
-          </w:tblCellMar>
-        </w:tblPrEx>
         <w:trPr>
           <w:tblHeader/>
         </w:trPr>
@@ -12195,12 +12085,6 @@
         </w:tc>
       </w:tr>
       <w:tr>
-        <w:tblPrEx>
-          <w:tblCellMar>
-            <w:top w:w="0" w:type="dxa"/>
-            <w:bottom w:w="0" w:type="dxa"/>
-          </w:tblCellMar>
-        </w:tblPrEx>
         <w:tc>
           <w:tcPr>
             <w:tcW w:w="2100" w:type="dxa"/>
@@ -12284,12 +12168,6 @@
         </w:tc>
       </w:tr>
       <w:tr>
-        <w:tblPrEx>
-          <w:tblCellMar>
-            <w:top w:w="0" w:type="dxa"/>
-            <w:bottom w:w="0" w:type="dxa"/>
-          </w:tblCellMar>
-        </w:tblPrEx>
         <w:tc>
           <w:tcPr>
             <w:tcW w:w="2100" w:type="dxa"/>
@@ -12417,12 +12295,6 @@
         </w:tc>
       </w:tr>
       <w:tr>
-        <w:tblPrEx>
-          <w:tblCellMar>
-            <w:top w:w="0" w:type="dxa"/>
-            <w:bottom w:w="0" w:type="dxa"/>
-          </w:tblCellMar>
-        </w:tblPrEx>
         <w:tc>
           <w:tcPr>
             <w:tcW w:w="2100" w:type="dxa"/>
@@ -12527,12 +12399,6 @@
         </w:tc>
       </w:tr>
       <w:tr>
-        <w:tblPrEx>
-          <w:tblCellMar>
-            <w:top w:w="0" w:type="dxa"/>
-            <w:bottom w:w="0" w:type="dxa"/>
-          </w:tblCellMar>
-        </w:tblPrEx>
         <w:tc>
           <w:tcPr>
             <w:tcW w:w="2100" w:type="dxa"/>
@@ -12626,12 +12492,6 @@
         </w:tc>
       </w:tr>
       <w:tr>
-        <w:tblPrEx>
-          <w:tblCellMar>
-            <w:top w:w="0" w:type="dxa"/>
-            <w:bottom w:w="0" w:type="dxa"/>
-          </w:tblCellMar>
-        </w:tblPrEx>
         <w:tc>
           <w:tcPr>
             <w:tcW w:w="2100" w:type="dxa"/>
@@ -12893,7 +12753,7 @@
           <w:lang w:val="pt-BR"/>
         </w:rPr>
       </w:pPr>
-      <w:bookmarkStart w:id="31" w:name="_Toc240219640"/>
+      <w:bookmarkStart w:id="31" w:name="_Toc240223151"/>
       <w:r>
         <w:rPr>
           <w:lang w:val="pt-BR"/>
@@ -12974,12 +12834,6 @@
         <w:gridCol w:w="2471"/>
       </w:tblGrid>
       <w:tr>
-        <w:tblPrEx>
-          <w:tblCellMar>
-            <w:top w:w="0" w:type="dxa"/>
-            <w:bottom w:w="0" w:type="dxa"/>
-          </w:tblCellMar>
-        </w:tblPrEx>
         <w:trPr>
           <w:tblHeader/>
         </w:trPr>
@@ -13095,12 +12949,6 @@
         </w:tc>
       </w:tr>
       <w:tr>
-        <w:tblPrEx>
-          <w:tblCellMar>
-            <w:top w:w="0" w:type="dxa"/>
-            <w:bottom w:w="0" w:type="dxa"/>
-          </w:tblCellMar>
-        </w:tblPrEx>
         <w:tc>
           <w:tcPr>
             <w:tcW w:w="1700" w:type="dxa"/>
@@ -13199,12 +13047,6 @@
         </w:tc>
       </w:tr>
       <w:tr>
-        <w:tblPrEx>
-          <w:tblCellMar>
-            <w:top w:w="0" w:type="dxa"/>
-            <w:bottom w:w="0" w:type="dxa"/>
-          </w:tblCellMar>
-        </w:tblPrEx>
         <w:tc>
           <w:tcPr>
             <w:tcW w:w="1700" w:type="dxa"/>
@@ -13319,12 +13161,6 @@
         </w:tc>
       </w:tr>
       <w:tr>
-        <w:tblPrEx>
-          <w:tblCellMar>
-            <w:top w:w="0" w:type="dxa"/>
-            <w:bottom w:w="0" w:type="dxa"/>
-          </w:tblCellMar>
-        </w:tblPrEx>
         <w:tc>
           <w:tcPr>
             <w:tcW w:w="1700" w:type="dxa"/>
@@ -13440,12 +13276,6 @@
         </w:tc>
       </w:tr>
       <w:tr>
-        <w:tblPrEx>
-          <w:tblCellMar>
-            <w:top w:w="0" w:type="dxa"/>
-            <w:bottom w:w="0" w:type="dxa"/>
-          </w:tblCellMar>
-        </w:tblPrEx>
         <w:tc>
           <w:tcPr>
             <w:tcW w:w="1700" w:type="dxa"/>
@@ -13584,7 +13414,7 @@
           <w:lang w:val="pt-BR"/>
         </w:rPr>
       </w:pPr>
-      <w:bookmarkStart w:id="32" w:name="_Toc240219641"/>
+      <w:bookmarkStart w:id="32" w:name="_Toc240223152"/>
       <w:r>
         <w:rPr>
           <w:lang w:val="pt-BR"/>
@@ -13890,7 +13720,7 @@
           <w:lang w:val="pt-BR"/>
         </w:rPr>
       </w:pPr>
-      <w:bookmarkStart w:id="33" w:name="_Toc240219642"/>
+      <w:bookmarkStart w:id="33" w:name="_Toc240223153"/>
       <w:r>
         <w:rPr>
           <w:lang w:val="pt-BR"/>
@@ -14104,7 +13934,7 @@
           <w:lang w:val="pt-BR"/>
         </w:rPr>
       </w:pPr>
-      <w:bookmarkStart w:id="34" w:name="_Toc240219643"/>
+      <w:bookmarkStart w:id="34" w:name="_Toc240223154"/>
       <w:r>
         <w:rPr>
           <w:lang w:val="pt-BR"/>
@@ -14189,12 +14019,6 @@
         <w:gridCol w:w="3771"/>
       </w:tblGrid>
       <w:tr>
-        <w:tblPrEx>
-          <w:tblCellMar>
-            <w:top w:w="0" w:type="dxa"/>
-            <w:bottom w:w="0" w:type="dxa"/>
-          </w:tblCellMar>
-        </w:tblPrEx>
         <w:trPr>
           <w:tblHeader/>
         </w:trPr>
@@ -14313,12 +14137,6 @@
         </w:tc>
       </w:tr>
       <w:tr>
-        <w:tblPrEx>
-          <w:tblCellMar>
-            <w:top w:w="0" w:type="dxa"/>
-            <w:bottom w:w="0" w:type="dxa"/>
-          </w:tblCellMar>
-        </w:tblPrEx>
         <w:tc>
           <w:tcPr>
             <w:tcW w:w="2100" w:type="dxa"/>
@@ -14393,12 +14211,6 @@
         </w:tc>
       </w:tr>
       <w:tr>
-        <w:tblPrEx>
-          <w:tblCellMar>
-            <w:top w:w="0" w:type="dxa"/>
-            <w:bottom w:w="0" w:type="dxa"/>
-          </w:tblCellMar>
-        </w:tblPrEx>
         <w:tc>
           <w:tcPr>
             <w:tcW w:w="2100" w:type="dxa"/>
@@ -14521,12 +14333,6 @@
         </w:tc>
       </w:tr>
       <w:tr>
-        <w:tblPrEx>
-          <w:tblCellMar>
-            <w:top w:w="0" w:type="dxa"/>
-            <w:bottom w:w="0" w:type="dxa"/>
-          </w:tblCellMar>
-        </w:tblPrEx>
         <w:tc>
           <w:tcPr>
             <w:tcW w:w="2100" w:type="dxa"/>
@@ -14649,12 +14455,6 @@
         </w:tc>
       </w:tr>
       <w:tr>
-        <w:tblPrEx>
-          <w:tblCellMar>
-            <w:top w:w="0" w:type="dxa"/>
-            <w:bottom w:w="0" w:type="dxa"/>
-          </w:tblCellMar>
-        </w:tblPrEx>
         <w:tc>
           <w:tcPr>
             <w:tcW w:w="2100" w:type="dxa"/>
@@ -14729,12 +14529,6 @@
         </w:tc>
       </w:tr>
       <w:tr>
-        <w:tblPrEx>
-          <w:tblCellMar>
-            <w:top w:w="0" w:type="dxa"/>
-            <w:bottom w:w="0" w:type="dxa"/>
-          </w:tblCellMar>
-        </w:tblPrEx>
         <w:tc>
           <w:tcPr>
             <w:tcW w:w="2100" w:type="dxa"/>
@@ -14857,12 +14651,6 @@
         </w:tc>
       </w:tr>
       <w:tr>
-        <w:tblPrEx>
-          <w:tblCellMar>
-            <w:top w:w="0" w:type="dxa"/>
-            <w:bottom w:w="0" w:type="dxa"/>
-          </w:tblCellMar>
-        </w:tblPrEx>
         <w:tc>
           <w:tcPr>
             <w:tcW w:w="2100" w:type="dxa"/>
@@ -15072,7 +14860,7 @@
           <w:lang w:val="pt-BR"/>
         </w:rPr>
       </w:pPr>
-      <w:bookmarkStart w:id="35" w:name="_Toc240219644"/>
+      <w:bookmarkStart w:id="35" w:name="_Toc240223155"/>
       <w:r>
         <w:rPr>
           <w:lang w:val="pt-BR"/>
@@ -15246,7 +15034,7 @@
           <w:lang w:val="pt-BR"/>
         </w:rPr>
       </w:pPr>
-      <w:bookmarkStart w:id="36" w:name="_Toc240219645"/>
+      <w:bookmarkStart w:id="36" w:name="_Toc240223156"/>
       <w:r>
         <w:rPr>
           <w:lang w:val="pt-BR"/>
@@ -15567,7 +15355,7 @@
           <w:lang w:val="pt-BR"/>
         </w:rPr>
       </w:pPr>
-      <w:bookmarkStart w:id="37" w:name="_Toc240219646"/>
+      <w:bookmarkStart w:id="37" w:name="_Toc240223157"/>
       <w:r>
         <w:rPr>
           <w:lang w:val="pt-BR"/>

</xml_diff>